<commit_message>
feat: adiciona ADR-006 e atualiza matriz de rastreabilidade
- ADR-006: decisão de autenticação/autorização com Spring Security + JWT + RBAC
  cobre RNF2 (só lojista/admin altera preços) e fecha RF11/RNF06 na matriz
- Matriz atualizada: RF11 e RNF06 agora referenciam ADR-006 (removida Nota 1)
- matriz-rastreabilidade.docx regenerado com as correções

Co-Authored-By: Claude Sonnet 4.6 <noreply@anthropic.com>
Claude-Session: https://claude.ai/code/session_014jhoPTseCAcUJjAuyorMJ2
</commit_message>
<xml_diff>
--- a/matriz-rastreabilidade.docx
+++ b/matriz-rastreabilidade.docx
@@ -1035,7 +1035,7 @@
                 <w:sz w:val="18"/>
                 <w:szCs w:val="18"/>
               </w:rPr>
-              <w:t xml:space="preserve">— (ver Nota 1)</w:t>
+              <w:t xml:space="preserve">ADR-006</w:t>
             </w:r>
           </w:p>
         </w:tc>
@@ -1051,7 +1051,7 @@
                 <w:sz w:val="18"/>
                 <w:szCs w:val="18"/>
               </w:rPr>
-              <w:t xml:space="preserve">Spring Security, autorização por perfil (RBAC)</w:t>
+              <w:t xml:space="preserve">Spring Security, RBAC (ROLE_LOJISTA, ROLE_ADMIN)</w:t>
             </w:r>
           </w:p>
         </w:tc>
@@ -2481,7 +2481,7 @@
                 <w:sz w:val="18"/>
                 <w:szCs w:val="18"/>
               </w:rPr>
-              <w:t xml:space="preserve">— (ver Nota 1)</w:t>
+              <w:t xml:space="preserve">ADR-006</w:t>
             </w:r>
           </w:p>
         </w:tc>
@@ -2497,7 +2497,7 @@
                 <w:sz w:val="18"/>
                 <w:szCs w:val="18"/>
               </w:rPr>
-              <w:t xml:space="preserve">HTTPS, Spring Security, cartão não armazenado</w:t>
+              <w:t xml:space="preserve">Spring Security, JWT, cartão não armazenado (delegado ao gateway — ADR-004)</w:t>
             </w:r>
           </w:p>
         </w:tc>
@@ -2613,21 +2613,6 @@
       </w:pPr>
       <w:r>
         <w:t xml:space="preserve">Notas</w:t>
-      </w:r>
-    </w:p>
-    <w:p>
-      <w:pPr>
-        <w:spacing w:after="100" w:before="200"/>
-      </w:pPr>
-      <w:r>
-        <w:rPr>
-          <w:i/>
-          <w:iCs/>
-          <w:color w:val="444444"/>
-          <w:sz w:val="16"/>
-          <w:szCs w:val="16"/>
-        </w:rPr>
-        <w:t xml:space="preserve">Nota 1 — RF11 e RNF06 não possuem ADR dedicada: são cobertos pela configuração de Spring Security e pela máquina de estados. Caso a equipe tome uma decisão explícita (ex.: JWT vs. sessão HTTP), registrar como ADR-006.</w:t>
       </w:r>
     </w:p>
     <w:p>

</xml_diff>